<commit_message>
update: informe de evidencias finalizado con capturas de github
</commit_message>
<xml_diff>
--- a/Evidencias evaluacion unidad 2.docx
+++ b/Evidencias evaluacion unidad 2.docx
@@ -9,11 +9,47 @@
           <w:lang w:val="en-US"/>
         </w:rPr>
       </w:pPr>
+      <w:proofErr w:type="spellStart"/>
       <w:r>
         <w:rPr>
           <w:lang w:val="en-US"/>
         </w:rPr>
-        <w:t>Evidencias evaluacion unidad 2</w:t>
+        <w:t>Evidencias</w:t>
+      </w:r>
+      <w:proofErr w:type="spellEnd"/>
+      <w:r>
+        <w:rPr>
+          <w:lang w:val="en-US"/>
+        </w:rPr>
+        <w:t xml:space="preserve"> </w:t>
+      </w:r>
+      <w:proofErr w:type="spellStart"/>
+      <w:r>
+        <w:rPr>
+          <w:lang w:val="en-US"/>
+        </w:rPr>
+        <w:t>evaluacion</w:t>
+      </w:r>
+      <w:proofErr w:type="spellEnd"/>
+      <w:r>
+        <w:rPr>
+          <w:lang w:val="en-US"/>
+        </w:rPr>
+        <w:t xml:space="preserve"> </w:t>
+      </w:r>
+      <w:proofErr w:type="spellStart"/>
+      <w:r>
+        <w:rPr>
+          <w:lang w:val="en-US"/>
+        </w:rPr>
+        <w:t>unidad</w:t>
+      </w:r>
+      <w:proofErr w:type="spellEnd"/>
+      <w:r>
+        <w:rPr>
+          <w:lang w:val="en-US"/>
+        </w:rPr>
+        <w:t xml:space="preserve"> 2</w:t>
       </w:r>
     </w:p>
     <w:p>
@@ -35,7 +71,18 @@
         <w:t>Estructura de las carpetas en e</w:t>
       </w:r>
       <w:r>
-        <w:t xml:space="preserve">l proyecto </w:t>
+        <w:t>l proyecto</w:t>
+      </w:r>
+      <w:r>
+        <w:t xml:space="preserve">: en esta imagen se ve bien el explorador de visual </w:t>
+      </w:r>
+      <w:proofErr w:type="spellStart"/>
+      <w:r>
+        <w:t>studio</w:t>
+      </w:r>
+      <w:proofErr w:type="spellEnd"/>
+      <w:r>
+        <w:t xml:space="preserve"> con las carpetas organizadas por capas </w:t>
       </w:r>
     </w:p>
     <w:p>
@@ -137,18 +184,33 @@
         </w:numPr>
       </w:pPr>
       <w:r>
-        <w:lastRenderedPageBreak/>
-        <w:t xml:space="preserve">Captura de los endpoints </w:t>
+        <w:t xml:space="preserve">Captura de los </w:t>
+      </w:r>
+      <w:proofErr w:type="spellStart"/>
+      <w:r>
+        <w:t>endpoints</w:t>
+      </w:r>
+      <w:proofErr w:type="spellEnd"/>
+    </w:p>
+    <w:p>
+      <w:pPr>
+        <w:ind w:left="360"/>
+      </w:pPr>
+      <w:r>
+        <w:t xml:space="preserve"> </w:t>
+      </w:r>
+      <w:r>
+        <w:t xml:space="preserve">Se muestra la lista de los alumnos cargados y registrados </w:t>
       </w:r>
       <w:r>
         <w:rPr>
           <w:noProof/>
         </w:rPr>
         <w:drawing>
-          <wp:inline distT="0" distB="0" distL="0" distR="0" wp14:anchorId="67D8D218" wp14:editId="7B6C91B3">
-            <wp:extent cx="5943600" cy="4617720"/>
-            <wp:effectExtent l="0" t="0" r="0" b="0"/>
-            <wp:docPr id="762400764" name="Imagen 2"/>
+          <wp:inline distT="0" distB="0" distL="0" distR="0" wp14:anchorId="652ABF7E" wp14:editId="75D6F691">
+            <wp:extent cx="5935980" cy="4640580"/>
+            <wp:effectExtent l="0" t="0" r="7620" b="7620"/>
+            <wp:docPr id="699076999" name="Imagen 1"/>
             <wp:cNvGraphicFramePr>
               <a:graphicFrameLocks xmlns:a="http://schemas.openxmlformats.org/drawingml/2006/main" noChangeAspect="1"/>
             </wp:cNvGraphicFramePr>
@@ -156,7 +218,7 @@
               <a:graphicData uri="http://schemas.openxmlformats.org/drawingml/2006/picture">
                 <pic:pic xmlns:pic="http://schemas.openxmlformats.org/drawingml/2006/picture">
                   <pic:nvPicPr>
-                    <pic:cNvPr id="0" name="Picture 2"/>
+                    <pic:cNvPr id="0" name="Picture 1"/>
                     <pic:cNvPicPr>
                       <a:picLocks noChangeAspect="1" noChangeArrowheads="1"/>
                     </pic:cNvPicPr>
@@ -177,7 +239,7 @@
                   <pic:spPr bwMode="auto">
                     <a:xfrm>
                       <a:off x="0" y="0"/>
-                      <a:ext cx="5943600" cy="4617720"/>
+                      <a:ext cx="5935980" cy="4640580"/>
                     </a:xfrm>
                     <a:prstGeom prst="rect">
                       <a:avLst/>
@@ -216,6 +278,31 @@
     </w:p>
     <w:p>
       <w:pPr>
+        <w:ind w:left="360"/>
+      </w:pPr>
+    </w:p>
+    <w:p>
+      <w:pPr>
+        <w:ind w:left="360"/>
+      </w:pPr>
+    </w:p>
+    <w:p>
+      <w:pPr>
+        <w:ind w:left="360"/>
+      </w:pPr>
+    </w:p>
+    <w:p>
+      <w:pPr>
+        <w:ind w:left="360"/>
+      </w:pPr>
+    </w:p>
+    <w:p>
+      <w:pPr>
+        <w:ind w:left="360"/>
+      </w:pPr>
+    </w:p>
+    <w:p>
+      <w:pPr>
         <w:pStyle w:val="Prrafodelista"/>
         <w:numPr>
           <w:ilvl w:val="0"/>
@@ -223,7 +310,16 @@
         </w:numPr>
       </w:pPr>
       <w:r>
+        <w:lastRenderedPageBreak/>
         <w:t xml:space="preserve">Servidor corriendo en consola </w:t>
+      </w:r>
+    </w:p>
+    <w:p>
+      <w:pPr>
+        <w:ind w:left="360"/>
+      </w:pPr>
+      <w:r>
+        <w:t>Muestra en la terminal operando el puerto 3000 y dándote el link para ir directamente a ver la app</w:t>
       </w:r>
     </w:p>
     <w:p>
@@ -291,6 +387,101 @@
     </w:p>
     <w:p>
       <w:pPr>
+        <w:ind w:left="360"/>
+      </w:pPr>
+    </w:p>
+    <w:p>
+      <w:pPr>
+        <w:ind w:left="360"/>
+      </w:pPr>
+    </w:p>
+    <w:p>
+      <w:pPr>
+        <w:ind w:left="360"/>
+      </w:pPr>
+    </w:p>
+    <w:p>
+      <w:pPr>
+        <w:ind w:left="360"/>
+      </w:pPr>
+    </w:p>
+    <w:p>
+      <w:pPr>
+        <w:ind w:left="360"/>
+      </w:pPr>
+    </w:p>
+    <w:p>
+      <w:pPr>
+        <w:ind w:left="360"/>
+      </w:pPr>
+    </w:p>
+    <w:p>
+      <w:pPr>
+        <w:ind w:left="360"/>
+      </w:pPr>
+    </w:p>
+    <w:p>
+      <w:pPr>
+        <w:ind w:left="360"/>
+      </w:pPr>
+    </w:p>
+    <w:p>
+      <w:pPr>
+        <w:ind w:left="360"/>
+      </w:pPr>
+    </w:p>
+    <w:p>
+      <w:pPr>
+        <w:ind w:left="360"/>
+      </w:pPr>
+    </w:p>
+    <w:p>
+      <w:pPr>
+        <w:ind w:left="360"/>
+      </w:pPr>
+    </w:p>
+    <w:p>
+      <w:pPr>
+        <w:ind w:left="360"/>
+      </w:pPr>
+    </w:p>
+    <w:p>
+      <w:pPr>
+        <w:ind w:left="360"/>
+      </w:pPr>
+    </w:p>
+    <w:p>
+      <w:pPr>
+        <w:ind w:left="360"/>
+      </w:pPr>
+    </w:p>
+    <w:p>
+      <w:pPr>
+        <w:ind w:left="360"/>
+      </w:pPr>
+    </w:p>
+    <w:p>
+      <w:pPr>
+        <w:ind w:left="360"/>
+      </w:pPr>
+    </w:p>
+    <w:p>
+      <w:pPr>
+        <w:ind w:left="360"/>
+      </w:pPr>
+    </w:p>
+    <w:p>
+      <w:pPr>
+        <w:ind w:left="360"/>
+      </w:pPr>
+    </w:p>
+    <w:p>
+      <w:pPr>
+        <w:ind w:left="360"/>
+      </w:pPr>
+    </w:p>
+    <w:p>
+      <w:pPr>
         <w:pStyle w:val="Prrafodelista"/>
         <w:numPr>
           <w:ilvl w:val="0"/>
@@ -298,10 +489,20 @@
         </w:numPr>
       </w:pPr>
       <w:r>
-        <w:t xml:space="preserve">Captura del flujo </w:t>
-      </w:r>
-    </w:p>
-    <w:p/>
+        <w:lastRenderedPageBreak/>
+        <w:t>Captura del flujo</w:t>
+      </w:r>
+    </w:p>
+    <w:p>
+      <w:r>
+        <w:t xml:space="preserve">Aquí se muestra como el buscador de alumnos funciona mas el ingreso o registro de alumnos esta con sus 6 campos para recibir la </w:t>
+      </w:r>
+      <w:proofErr w:type="spellStart"/>
+      <w:r>
+        <w:t>informacion</w:t>
+      </w:r>
+      <w:proofErr w:type="spellEnd"/>
+    </w:p>
     <w:p>
       <w:r>
         <w:rPr>
@@ -325,7 +526,7 @@
                     </pic:cNvPicPr>
                   </pic:nvPicPr>
                   <pic:blipFill>
-                    <a:blip r:embed="rId8">
+                    <a:blip r:embed="rId6">
                       <a:extLst>
                         <a:ext uri="{28A0092B-C50C-407E-A947-70E740481C1C}">
                           <a14:useLocalDpi xmlns:a14="http://schemas.microsoft.com/office/drawing/2010/main" val="0"/>
@@ -378,7 +579,7 @@
                     </pic:cNvPicPr>
                   </pic:nvPicPr>
                   <pic:blipFill>
-                    <a:blip r:embed="rId9">
+                    <a:blip r:embed="rId8">
                       <a:extLst>
                         <a:ext uri="{28A0092B-C50C-407E-A947-70E740481C1C}">
                           <a14:useLocalDpi xmlns:a14="http://schemas.microsoft.com/office/drawing/2010/main" val="0"/>
@@ -422,20 +623,33 @@
         </w:numPr>
       </w:pPr>
       <w:r>
+        <w:lastRenderedPageBreak/>
         <w:t>Captura del repositorio</w:t>
       </w:r>
     </w:p>
-    <w:p/>
+    <w:p>
+      <w:r>
+        <w:t xml:space="preserve">Aquí se ve el repositorio con el </w:t>
+      </w:r>
+      <w:proofErr w:type="spellStart"/>
+      <w:r>
+        <w:t>readme</w:t>
+      </w:r>
+      <w:proofErr w:type="spellEnd"/>
+      <w:r>
+        <w:t xml:space="preserve"> el documento y todo lo que lleva en si dentro </w:t>
+      </w:r>
+    </w:p>
     <w:p>
       <w:r>
         <w:rPr>
           <w:noProof/>
         </w:rPr>
         <w:drawing>
-          <wp:inline distT="0" distB="0" distL="0" distR="0" wp14:anchorId="2A9F368D" wp14:editId="2AF9293A">
-            <wp:extent cx="5943600" cy="2453640"/>
-            <wp:effectExtent l="0" t="0" r="0" b="3810"/>
-            <wp:docPr id="739319167" name="Imagen 6"/>
+          <wp:inline distT="0" distB="0" distL="0" distR="0" wp14:anchorId="2189F012" wp14:editId="715CB7FE">
+            <wp:extent cx="5935980" cy="4632960"/>
+            <wp:effectExtent l="0" t="0" r="7620" b="0"/>
+            <wp:docPr id="1092696162" name="Imagen 1"/>
             <wp:cNvGraphicFramePr>
               <a:graphicFrameLocks xmlns:a="http://schemas.openxmlformats.org/drawingml/2006/main" noChangeAspect="1"/>
             </wp:cNvGraphicFramePr>
@@ -443,13 +657,13 @@
               <a:graphicData uri="http://schemas.openxmlformats.org/drawingml/2006/picture">
                 <pic:pic xmlns:pic="http://schemas.openxmlformats.org/drawingml/2006/picture">
                   <pic:nvPicPr>
-                    <pic:cNvPr id="0" name="Picture 6"/>
+                    <pic:cNvPr id="0" name="Picture 1"/>
                     <pic:cNvPicPr>
                       <a:picLocks noChangeAspect="1" noChangeArrowheads="1"/>
                     </pic:cNvPicPr>
                   </pic:nvPicPr>
                   <pic:blipFill>
-                    <a:blip r:embed="rId10">
+                    <a:blip r:embed="rId9">
                       <a:extLst>
                         <a:ext uri="{28A0092B-C50C-407E-A947-70E740481C1C}">
                           <a14:useLocalDpi xmlns:a14="http://schemas.microsoft.com/office/drawing/2010/main" val="0"/>
@@ -464,7 +678,7 @@
                   <pic:spPr bwMode="auto">
                     <a:xfrm>
                       <a:off x="0" y="0"/>
-                      <a:ext cx="5943600" cy="2453640"/>
+                      <a:ext cx="5935980" cy="4632960"/>
                     </a:xfrm>
                     <a:prstGeom prst="rect">
                       <a:avLst/>

</xml_diff>